<commit_message>
Fix Case 3: the staleness table covers 26% of rows, not all of them
Negative days_since_update values fall outside the pd.cut bins, so 89,351 of
120,507 rows became NaN and were silently dropped by the group-by. The table
rendered and looked like a finding. Verdict on staleness downgraded from
"mixed" to "not yet tested"; the volume result is unaffected and does cover
all 120,507 rows.

Same broken feature already documented in Case 1. Also tightens a loose
"3.4x worse" to the actual 3.44x ratio.
</commit_message>
<xml_diff>
--- a/work/Portfolio cases - Muneeb Ur Rehman.docx
+++ b/work/Portfolio cases - Muneeb Ur Rehman.docx
@@ -1157,7 +1157,7 @@
           <w:b w:val="0"/>
           <w:i w:val="0"/>
         </w:rPr>
-        <w:t>Read as counts: of the top 50 pages, the forest got 31 right, the rule got 9, and shuffling the list got 8. The rule was barely better than random — about 3.4× worse than the forest on the same 21,610 test pages.</w:t>
+        <w:t>Read as counts: of the top 50 pages, the forest got 31 right, the rule got 9, and shuffling the list got 8. The rule was barely better than random. The forest scored 3.44× the rule on the same 21,610 test pages.</w:t>
       </w:r>
     </w:p>
     <w:p>
@@ -1712,7 +1712,7 @@
           <w:b/>
           <w:i w:val="0"/>
         </w:rPr>
-        <w:t>Staleness — doesn't rise cleanly.</w:t>
+        <w:t>Staleness — doesn't rise cleanly, and the table is smaller than it looks.</w:t>
       </w:r>
     </w:p>
     <w:tbl>
@@ -1932,7 +1932,87 @@
           <w:b w:val="0"/>
           <w:i w:val="0"/>
         </w:rPr>
-        <w:t xml:space="preserve">The 181–365 bucket is almost entirely declining, which supports the rule. But the middle bucket drops below the freshest bucket, and it holds 278 pages against 29,601. I'd call that </w:t>
+        <w:t xml:space="preserve">Read the Pages column before the Decline rate column. Those three buckets hold 31,156 pages — </w:t>
+      </w:r>
+      <w:r>
+        <w:rPr>
+          <w:b/>
+          <w:i w:val="0"/>
+        </w:rPr>
+        <w:t>26% of the 120,507 I started with.</w:t>
+      </w:r>
+      <w:r>
+        <w:rPr>
+          <w:b w:val="0"/>
+          <w:i w:val="0"/>
+        </w:rPr>
+        <w:t xml:space="preserve"> The other 89,351 have a negative </w:t>
+      </w:r>
+      <w:r>
+        <w:rPr>
+          <w:rFonts w:ascii="Consolas" w:hAnsi="Consolas"/>
+          <w:b w:val="0"/>
+          <w:i w:val="0"/>
+          <w:sz w:val="18"/>
+        </w:rPr>
+        <w:t>days_since_update</w:t>
+      </w:r>
+      <w:r>
+        <w:rPr>
+          <w:b w:val="0"/>
+          <w:i w:val="0"/>
+        </w:rPr>
+        <w:t xml:space="preserve">, so </w:t>
+      </w:r>
+      <w:r>
+        <w:rPr>
+          <w:rFonts w:ascii="Consolas" w:hAnsi="Consolas"/>
+          <w:b w:val="0"/>
+          <w:i w:val="0"/>
+          <w:sz w:val="18"/>
+        </w:rPr>
+        <w:t>pd.cut</w:t>
+      </w:r>
+      <w:r>
+        <w:rPr>
+          <w:b w:val="0"/>
+          <w:i w:val="0"/>
+        </w:rPr>
+        <w:t xml:space="preserve"> dropped them to </w:t>
+      </w:r>
+      <w:r>
+        <w:rPr>
+          <w:rFonts w:ascii="Consolas" w:hAnsi="Consolas"/>
+          <w:b w:val="0"/>
+          <w:i w:val="0"/>
+          <w:sz w:val="18"/>
+        </w:rPr>
+        <w:t>NaN</w:t>
+      </w:r>
+      <w:r>
+        <w:rPr>
+          <w:b w:val="0"/>
+          <w:i w:val="0"/>
+        </w:rPr>
+        <w:t xml:space="preserve"> and the group-by silently discarded three-quarters of my data without raising anything.</w:t>
+      </w:r>
+    </w:p>
+    <w:p>
+      <w:r>
+        <w:rPr>
+          <w:b w:val="0"/>
+          <w:i w:val="0"/>
+        </w:rPr>
+        <w:t>That's the same broken feature from Case 1, showing up somewhere I wasn't looking for it. In Case 1 it cost me three wrong predictions. Here it quietly deleted most of the evidence, and the table still rendered and still looked like a finding.</w:t>
+      </w:r>
+    </w:p>
+    <w:p>
+      <w:r>
+        <w:rPr>
+          <w:b w:val="0"/>
+          <w:i w:val="0"/>
+        </w:rPr>
+        <w:t xml:space="preserve">On what's left: the 181–365 bucket is almost entirely declining, which supports the rule. But the middle bucket drops below the freshest bucket while holding 278 pages against 29,601. I'd call that </w:t>
       </w:r>
       <w:r>
         <w:rPr>
@@ -1946,7 +2026,21 @@
           <w:b w:val="0"/>
           <w:i w:val="0"/>
         </w:rPr>
-        <w:t>, not confirmed — the shape is dominated by how few pages sit in the middle, and the freshest bucket declining at 43% is not what the rule predicts at all.</w:t>
+        <w:t xml:space="preserve">, not confirmed — and I'd weight it lightly, because a test run on a quarter of the rows, where the exclusion is caused by a defect rather than by chance, isn't a sample I can reason about. The honest verdict on staleness is </w:t>
+      </w:r>
+      <w:r>
+        <w:rPr>
+          <w:b w:val="0"/>
+          <w:i/>
+        </w:rPr>
+        <w:t>not yet tested</w:t>
+      </w:r>
+      <w:r>
+        <w:rPr>
+          <w:b w:val="0"/>
+          <w:i w:val="0"/>
+        </w:rPr>
+        <w:t>.</w:t>
       </w:r>
     </w:p>
     <w:p>
@@ -2222,7 +2316,7 @@
           <w:b w:val="0"/>
           <w:i w:val="0"/>
         </w:rPr>
-        <w:t xml:space="preserve">Monotonic, across 120,507 pages, in the opposite direction to the assumption. High-traffic pages decline </w:t>
+        <w:t xml:space="preserve">This one is whole: those four buckets sum to 120,507, every row accounted for. And it's monotonic in the opposite direction to the assumption. High-traffic pages decline </w:t>
       </w:r>
       <w:r>
         <w:rPr>
@@ -2236,7 +2330,7 @@
           <w:b w:val="0"/>
           <w:i w:val="0"/>
         </w:rPr>
-        <w:t>. So the "visible" half of the rule isn't finding pages at risk — it's finding the pages least likely to be at risk, and it's doing it consistently.</w:t>
+        <w:t>. So the "visible" half of the rule isn't finding pages at risk — it's finding the pages least likely to be at risk, and it's doing it consistently across the full dataset.</w:t>
       </w:r>
     </w:p>
     <w:p>
@@ -2275,7 +2369,23 @@
           <w:b w:val="0"/>
           <w:i w:val="0"/>
         </w:rPr>
-        <w:t xml:space="preserve"> of their traffic level, and I haven't controlled for anything.</w:t>
+        <w:t xml:space="preserve"> of their traffic level, and I haven't controlled for anything. The volume result stands on all 120,507 rows; the staleness result stands on 26% of them and should be re-run once </w:t>
+      </w:r>
+      <w:r>
+        <w:rPr>
+          <w:rFonts w:ascii="Consolas" w:hAnsi="Consolas"/>
+          <w:b w:val="0"/>
+          <w:i w:val="0"/>
+          <w:sz w:val="18"/>
+        </w:rPr>
+        <w:t>days_since_update</w:t>
+      </w:r>
+      <w:r>
+        <w:rPr>
+          <w:b w:val="0"/>
+          <w:i w:val="0"/>
+        </w:rPr>
+        <w:t xml:space="preserve"> is fixed.</w:t>
       </w:r>
     </w:p>
     <w:p>

</xml_diff>

<commit_message>
Qualify Case 1's 0.620 as a single-seed result, everywhere it appears
0.620 came from one GroupShuffleSplit at seed 42. The case study reported it as
a settled headline while prompt-ladder.md already said a different seed gives
materially different numbers - the portfolio made a cleaner claim than my own
analysis supports.

Case 1 now leads with the comparison (31 of top 50 vs the rule's 9 on the same
split) and carries the decimal with its caveat. The content map forbids a bare
0.620 anywhere on the site. The figure's subtitle names the seed and its
footnote says the spread is unmeasured. Gather list adds three blocking items:
a multi-seed sweep, a leave-one-client-out run, and the count of distinct
clients in the test split - which was never recorded.
</commit_message>
<xml_diff>
--- a/work/Portfolio cases - Muneeb Ur Rehman.docx
+++ b/work/Portfolio cases - Muneeb Ur Rehman.docx
@@ -969,7 +969,21 @@
           <w:b w:val="0"/>
           <w:i w:val="0"/>
         </w:rPr>
-        <w:t>Same test split, same metric, all four ranked side by side:</w:t>
+        <w:t xml:space="preserve">Same test split, same metric, all four ranked side by side — </w:t>
+      </w:r>
+      <w:r>
+        <w:rPr>
+          <w:b/>
+          <w:i w:val="0"/>
+        </w:rPr>
+        <w:t>one split, seed 42</w:t>
+      </w:r>
+      <w:r>
+        <w:rPr>
+          <w:b w:val="0"/>
+          <w:i w:val="0"/>
+        </w:rPr>
+        <w:t>:</w:t>
       </w:r>
     </w:p>
     <w:tbl>
@@ -1016,7 +1030,7 @@
                 <w:b/>
                 <w:i w:val="0"/>
               </w:rPr>
-              <w:t>Precision@50</w:t>
+              <w:t>Precision@50 (single split, seed 42)</w:t>
             </w:r>
           </w:p>
         </w:tc>
@@ -1141,7 +1155,7 @@
             <w:r/>
             <w:r>
               <w:rPr>
-                <w:b/>
+                <w:b w:val="0"/>
                 <w:i w:val="0"/>
               </w:rPr>
               <w:t>0.620</w:t>
@@ -1157,7 +1171,62 @@
           <w:b w:val="0"/>
           <w:i w:val="0"/>
         </w:rPr>
-        <w:t>Read as counts: of the top 50 pages, the forest got 31 right, the rule got 9, and shuffling the list got 8. The rule was barely better than random. The forest scored 3.44× the rule on the same 21,610 test pages.</w:t>
+        <w:t>Read as counts: of the top 50 pages, the forest got 31 right, the rule got 9, and shuffling the list got 8. On this split the forest scored 3.44× the rule.</w:t>
+      </w:r>
+    </w:p>
+    <w:p>
+      <w:r>
+        <w:rPr>
+          <w:b/>
+          <w:i w:val="0"/>
+        </w:rPr>
+        <w:t>The caveat belongs beside that number, not under it.</w:t>
+      </w:r>
+      <w:r>
+        <w:rPr>
+          <w:b w:val="0"/>
+          <w:i w:val="0"/>
+        </w:rPr>
+        <w:t xml:space="preserve"> 0.620 is one draw. </w:t>
+      </w:r>
+      <w:r>
+        <w:rPr>
+          <w:rFonts w:ascii="Consolas" w:hAnsi="Consolas"/>
+          <w:b w:val="0"/>
+          <w:i w:val="0"/>
+          <w:sz w:val="18"/>
+        </w:rPr>
+        <w:t>GroupShuffleSplit(random_state=42)</w:t>
+      </w:r>
+      <w:r>
+        <w:rPr>
+          <w:b w:val="0"/>
+          <w:i w:val="0"/>
+        </w:rPr>
+        <w:t xml:space="preserve"> assigns one particular set of clients to the test side, and because pages within a client move together, changing the seed moves the whole table — not just the last row. I have not run the split across multiple seeds, so I do not know the spread around 0.620. I know only that a spread exists, because my own read of this table says the base rate is "a property of whichever clients landed in test under this seed." I also never recorded how many distinct clients ended up in the test side, which is the number that decides whether 21,610 rows is a large sample or a small one wearing a large sample's clothes.</w:t>
+      </w:r>
+    </w:p>
+    <w:p>
+      <w:r>
+        <w:rPr>
+          <w:b w:val="0"/>
+          <w:i w:val="0"/>
+        </w:rPr>
+        <w:t xml:space="preserve">So the defensible claim here is the </w:t>
+      </w:r>
+      <w:r>
+        <w:rPr>
+          <w:b/>
+          <w:i w:val="0"/>
+        </w:rPr>
+        <w:t>comparison</w:t>
+      </w:r>
+      <w:r>
+        <w:rPr>
+          <w:b w:val="0"/>
+          <w:i w:val="0"/>
+        </w:rPr>
+        <w:t>, not the decimal: on the same split, with the same metric, the learned ranking beat the hand-written rule and beat random order. Quoting 0.620 as "the model's score" would be reporting one draw as though it were the distribution — and a single-seed number in a headline is exactly the kind of thing I'd catch in someone else's work.</w:t>
       </w:r>
     </w:p>
     <w:p>
@@ -1253,7 +1322,30 @@
           <w:b w:val="0"/>
           <w:i w:val="0"/>
         </w:rPr>
-        <w:t xml:space="preserve"> it doesn't predict Google's ranking algorithm, and it doesn't show that refreshing a page recovers its traffic. That needs an experiment I haven't run. It ranks pages for a human to look at.</w:t>
+        <w:t xml:space="preserve"> it doesn't predict Google's ranking algorithm, and it doesn't show that refreshing a page recovers its traffic — that needs an experiment I haven't run. It ranks pages for a human to look at.</w:t>
+      </w:r>
+    </w:p>
+    <w:p>
+      <w:r>
+        <w:rPr>
+          <w:b w:val="0"/>
+          <w:i w:val="0"/>
+        </w:rPr>
+        <w:t xml:space="preserve">It also doesn't say the model scores 0.620. It says that on one client-grouped split with seed 42 it scored 0.620, that the rule scored 0.180 on that same split, and that the stability of both across seeds and across held-out clients is </w:t>
+      </w:r>
+      <w:r>
+        <w:rPr>
+          <w:b/>
+          <w:i w:val="0"/>
+        </w:rPr>
+        <w:t>untested</w:t>
+      </w:r>
+      <w:r>
+        <w:rPr>
+          <w:b w:val="0"/>
+          <w:i w:val="0"/>
+        </w:rPr>
+        <w:t>. The outstanding checks are a multi-seed sweep and a leave-one-client-out run; until those exist, the comparison stands and the decimal doesn't.</w:t>
       </w:r>
     </w:p>
     <w:p>

</xml_diff>

<commit_message>
Pin the extraction window; make LOCO the headline for Case 1
Pins bounds CTEs to DATE '2026-03-31' in w03-w06 (5 sites) and prints the
window in the output, so it is verifiable in the artifact rather than only
described. w03's Proof-2 span query still reports the true max - that one is
supposed to.

Case 1 now leads with leave-one-client-out: 21 of 24 clients beat their own
base rate, 2.28x mean lift, 10 outside the 95% band and all positive. The
single-split table is demoted to what it was - the number that prompted the
audit - carrying the post-pin values and the 0.30-0.62 seed range. Adds the
date-drift finding with its evidentiary gap named: the window was never logged,
so partition drift is a hypothesis, not a proven cause.

Flags capture-w05-results.png as a stale pre-pin receipt that contradicts the
case until w05 is re-run. Gather list adds the re-run, the re-capture, the w06
commit, and the FlyRank per-client-detail policy question.
</commit_message>
<xml_diff>
--- a/work/Portfolio cases - Muneeb Ur Rehman.docx
+++ b/work/Portfolio cases - Muneeb Ur Rehman.docx
@@ -966,24 +966,175 @@
     <w:p>
       <w:r>
         <w:rPr>
-          <w:b w:val="0"/>
-          <w:i w:val="0"/>
-        </w:rPr>
-        <w:t xml:space="preserve">Same test split, same metric, all four ranked side by side — </w:t>
-      </w:r>
-      <w:r>
-        <w:rPr>
           <w:b/>
           <w:i w:val="0"/>
         </w:rPr>
-        <w:t>one split, seed 42</w:t>
+        <w:t>The headline is leave-one-client-out.</w:t>
       </w:r>
       <w:r>
         <w:rPr>
           <w:b w:val="0"/>
           <w:i w:val="0"/>
         </w:rPr>
-        <w:t>:</w:t>
+        <w:t xml:space="preserve"> Every client held out in turn, the model trained on the other 23 and scored on the one it had never seen:</w:t>
+      </w:r>
+    </w:p>
+    <w:tbl>
+      <w:tblPr>
+        <w:tblStyle w:val="TableGrid"/>
+        <w:tblW w:type="auto" w:w="0"/>
+        <w:tblLayout w:type="autofit"/>
+        <w:tblLook w:firstColumn="1" w:firstRow="1" w:lastColumn="0" w:lastRow="0" w:noHBand="0" w:noVBand="1" w:val="04A0"/>
+      </w:tblPr>
+      <w:tblGrid>
+        <w:gridCol w:w="4320"/>
+        <w:gridCol w:w="4320"/>
+      </w:tblGrid>
+      <w:tr>
+        <w:tc>
+          <w:tcPr>
+            <w:tcW w:type="dxa" w:w="4320"/>
+          </w:tcPr>
+          <w:p>
+            <w:pPr>
+              <w:shd w:val="clear" w:fill="EDEDED"/>
+            </w:pPr>
+            <w:r/>
+            <w:r>
+              <w:rPr>
+                <w:b/>
+                <w:i w:val="0"/>
+              </w:rPr>
+              <w:t>Leave-one-client-out, 24 clients</w:t>
+            </w:r>
+          </w:p>
+        </w:tc>
+        <w:tc>
+          <w:tcPr>
+            <w:tcW w:type="dxa" w:w="4320"/>
+          </w:tcPr>
+          <w:p>
+            <w:pPr>
+              <w:shd w:val="clear" w:fill="EDEDED"/>
+            </w:pPr>
+            <w:r/>
+          </w:p>
+        </w:tc>
+      </w:tr>
+      <w:tr>
+        <w:tc>
+          <w:tcPr>
+            <w:tcW w:type="dxa" w:w="4320"/>
+          </w:tcPr>
+          <w:p>
+            <w:r/>
+            <w:r>
+              <w:rPr>
+                <w:b w:val="0"/>
+                <w:i w:val="0"/>
+              </w:rPr>
+              <w:t>Clients beating their own base rate</w:t>
+            </w:r>
+          </w:p>
+        </w:tc>
+        <w:tc>
+          <w:tcPr>
+            <w:tcW w:type="dxa" w:w="4320"/>
+          </w:tcPr>
+          <w:p>
+            <w:r/>
+            <w:r>
+              <w:rPr>
+                <w:b/>
+                <w:i w:val="0"/>
+              </w:rPr>
+              <w:t>21 of 24</w:t>
+            </w:r>
+          </w:p>
+        </w:tc>
+      </w:tr>
+      <w:tr>
+        <w:tc>
+          <w:tcPr>
+            <w:tcW w:type="dxa" w:w="4320"/>
+          </w:tcPr>
+          <w:p>
+            <w:r/>
+            <w:r>
+              <w:rPr>
+                <w:b w:val="0"/>
+                <w:i w:val="0"/>
+              </w:rPr>
+              <w:t>Mean lift over base rate</w:t>
+            </w:r>
+          </w:p>
+        </w:tc>
+        <w:tc>
+          <w:tcPr>
+            <w:tcW w:type="dxa" w:w="4320"/>
+          </w:tcPr>
+          <w:p>
+            <w:r/>
+            <w:r>
+              <w:rPr>
+                <w:b/>
+                <w:i w:val="0"/>
+              </w:rPr>
+              <w:t>2.28×</w:t>
+            </w:r>
+          </w:p>
+        </w:tc>
+      </w:tr>
+      <w:tr>
+        <w:tc>
+          <w:tcPr>
+            <w:tcW w:type="dxa" w:w="4320"/>
+          </w:tcPr>
+          <w:p>
+            <w:r/>
+            <w:r>
+              <w:rPr>
+                <w:b w:val="0"/>
+                <w:i w:val="0"/>
+              </w:rPr>
+              <w:t>Clients outside the 95% band</w:t>
+            </w:r>
+          </w:p>
+        </w:tc>
+        <w:tc>
+          <w:tcPr>
+            <w:tcW w:type="dxa" w:w="4320"/>
+          </w:tcPr>
+          <w:p>
+            <w:r/>
+            <w:r>
+              <w:rPr>
+                <w:b w:val="0"/>
+                <w:i w:val="0"/>
+              </w:rPr>
+              <w:t>10, against ~1 expected — and all 10 positive</w:t>
+            </w:r>
+          </w:p>
+        </w:tc>
+      </w:tr>
+    </w:tbl>
+    <w:p/>
+    <w:p>
+      <w:r>
+        <w:rPr>
+          <w:b w:val="0"/>
+          <w:i w:val="0"/>
+        </w:rPr>
+        <w:t>That last row is the one I'd defend hardest. If the ranking were noise you'd expect roughly one client to fall outside the band by chance, and you'd expect the strays to land on both sides. Ten landed outside, all in the same direction. That's a pattern, not a fluke.</w:t>
+      </w:r>
+    </w:p>
+    <w:p>
+      <w:r>
+        <w:rPr>
+          <w:b/>
+          <w:i w:val="0"/>
+        </w:rPr>
+        <w:t>The single-split table is not a co-equal result. It's the thing that made me suspicious.</w:t>
       </w:r>
     </w:p>
     <w:tbl>
@@ -1030,7 +1181,7 @@
                 <w:b/>
                 <w:i w:val="0"/>
               </w:rPr>
-              <w:t>Precision@50 (single split, seed 42)</w:t>
+              <w:t>Precision@50 — one split, seed 42</w:t>
             </w:r>
           </w:p>
         </w:tc>
@@ -1094,7 +1245,7 @@
                 <w:b w:val="0"/>
                 <w:i w:val="0"/>
               </w:rPr>
-              <w:t>0.180</w:t>
+              <w:t>0.200</w:t>
             </w:r>
           </w:p>
         </w:tc>
@@ -1158,7 +1309,7 @@
                 <w:b w:val="0"/>
                 <w:i w:val="0"/>
               </w:rPr>
-              <w:t>0.620</w:t>
+              <w:t>0.500</w:t>
             </w:r>
           </w:p>
         </w:tc>
@@ -1171,7 +1322,30 @@
           <w:b w:val="0"/>
           <w:i w:val="0"/>
         </w:rPr>
-        <w:t>Read as counts: of the top 50 pages, the forest got 31 right, the rule got 9, and shuffling the list got 8. On this split the forest scored 3.44× the rule.</w:t>
+        <w:t xml:space="preserve">I originally reported that 0.500 as the result. Then I ran the same split design across seven seeds and got </w:t>
+      </w:r>
+      <w:r>
+        <w:rPr>
+          <w:b/>
+          <w:i w:val="0"/>
+        </w:rPr>
+        <w:t>0.30 to 0.62</w:t>
+      </w:r>
+      <w:r>
+        <w:rPr>
+          <w:b w:val="0"/>
+          <w:i w:val="0"/>
+        </w:rPr>
+        <w:t>. The number hadn't moved because the model changed — it moved because a different set of clients happened to land on the test side, and pages within a client move together. One split was never a measurement; it was one draw I'd mistaken for one.</w:t>
+      </w:r>
+    </w:p>
+    <w:p>
+      <w:r>
+        <w:rPr>
+          <w:b w:val="0"/>
+          <w:i w:val="0"/>
+        </w:rPr>
+        <w:t>So the table above appears here as the trigger for the audit, explicitly labelled unstable, and LOCO is what I stand behind. Every number that follows in this case exists because an earlier number made me suspicious of itself.</w:t>
       </w:r>
     </w:p>
     <w:p>
@@ -1180,14 +1354,14 @@
           <w:b/>
           <w:i w:val="0"/>
         </w:rPr>
-        <w:t>The caveat belongs beside that number, not under it.</w:t>
+        <w:t>And then the audit had its own bug.</w:t>
       </w:r>
       <w:r>
         <w:rPr>
           <w:b w:val="0"/>
           <w:i w:val="0"/>
         </w:rPr>
-        <w:t xml:space="preserve"> 0.620 is one draw. </w:t>
+        <w:t xml:space="preserve"> Before I pinned the extraction window, LOCO showed 22 of 24 and 2.37×; after pinning to </w:t>
       </w:r>
       <w:r>
         <w:rPr>
@@ -1196,37 +1370,44 @@
           <w:i w:val="0"/>
           <w:sz w:val="18"/>
         </w:rPr>
-        <w:t>GroupShuffleSplit(random_state=42)</w:t>
+        <w:t>2026-03-31</w:t>
       </w:r>
       <w:r>
         <w:rPr>
           <w:b w:val="0"/>
           <w:i w:val="0"/>
         </w:rPr>
-        <w:t xml:space="preserve"> assigns one particular set of clients to the test side, and because pages within a client move together, changing the seed moves the whole table — not just the last row. I have not run the split across multiple seeds, so I do not know the spread around 0.620. I know only that a spread exists, because my own read of this table says the base rate is "a property of whichever clients landed in test under this seed." I also never recorded how many distinct clients ended up in the test side, which is the number that decides whether 21,610 rows is a large sample or a small one wearing a large sample's clothes.</w:t>
+        <w:t xml:space="preserve">, 21 of 24 and 2.28×. Same LOCO code, same seed, nothing else changed — so I attribute the difference to partition drift, </w:t>
       </w:r>
-    </w:p>
-    <w:p>
+      <w:r>
+        <w:rPr>
+          <w:rFonts w:ascii="Consolas" w:hAnsi="Consolas"/>
+          <w:b w:val="0"/>
+          <w:i w:val="0"/>
+          <w:sz w:val="18"/>
+        </w:rPr>
+        <w:t>MAX(report_date)</w:t>
+      </w:r>
       <w:r>
         <w:rPr>
           <w:b w:val="0"/>
           <w:i w:val="0"/>
         </w:rPr>
-        <w:t xml:space="preserve">So the defensible claim here is the </w:t>
+        <w:t xml:space="preserve"> resolving against a warehouse that had moved under me. </w:t>
       </w:r>
       <w:r>
         <w:rPr>
           <w:b/>
           <w:i w:val="0"/>
         </w:rPr>
-        <w:t>comparison</w:t>
+        <w:t>I can't verify that.</w:t>
       </w:r>
       <w:r>
         <w:rPr>
           <w:b w:val="0"/>
           <w:i w:val="0"/>
         </w:rPr>
-        <w:t>, not the decimal: on the same split, with the same metric, the learned ranking beat the hand-written rule and beat random order. Quoting 0.620 as "the model's score" would be reporting one draw as though it were the distribution — and a single-seed number in a headline is exactly the kind of thing I'd catch in someone else's work.</w:t>
+        <w:t xml:space="preserve"> I never logged what the window resolved to on the earlier run, so I can only infer the cause from the fact that nothing else differed. That missing log is itself the defect, and it's exactly what the pinning fixes.</w:t>
       </w:r>
     </w:p>
     <w:p>
@@ -1331,21 +1512,16 @@
           <w:b w:val="0"/>
           <w:i w:val="0"/>
         </w:rPr>
-        <w:t xml:space="preserve">It also doesn't say the model scores 0.620. It says that on one client-grouped split with seed 42 it scored 0.620, that the rule scored 0.180 on that same split, and that the stability of both across seeds and across held-out clients is </w:t>
+        <w:t>It also doesn't say the model scores 0.500, or 0.620, or any single number. On one seed-42 split it scored 0.500; across seven seeds of that same design, 0.30 to 0.62. The claim I'll defend is the LOCO one — 21 of 24 held-out clients beat their own base rate at a mean lift of 2.28× — because that's the only version where every client got tested rather than one lucky draw of them.</w:t>
       </w:r>
-      <w:r>
-        <w:rPr>
-          <w:b/>
-          <w:i w:val="0"/>
-        </w:rPr>
-        <w:t>untested</w:t>
-      </w:r>
+    </w:p>
+    <w:p>
       <w:r>
         <w:rPr>
           <w:b w:val="0"/>
           <w:i w:val="0"/>
         </w:rPr>
-        <w:t>. The outstanding checks are a multi-seed sweep and a leave-one-client-out run; until those exist, the comparison stands and the decimal doesn't.</w:t>
+        <w:t>And the date-drift explanation is a hypothesis, not a finding. I can't prove partition drift caused the 22/24 → 21/24 shift, only that nothing else changed.</w:t>
       </w:r>
     </w:p>
     <w:p>
@@ -2912,7 +3088,7 @@
           <w:b w:val="0"/>
           <w:i w:val="0"/>
         </w:rPr>
-        <w:t>I built a ranked review queue for a content team with 120,000 pages and time for fifty. On a</w:t>
+        <w:t>I built a ranked review queue for a content team with 120,000 pages and time for fifty. Held out</w:t>
       </w:r>
     </w:p>
     <w:p>
@@ -2928,7 +3104,7 @@
           <w:b w:val="0"/>
           <w:i w:val="0"/>
         </w:rPr>
-        <w:t>client-grouped test split, 31 of the top 50 pages my model picked were genuinely declining. The</w:t>
+        <w:t>one client at a time, it beat that client's own base rate for 21 of 24 clients, averaging 2.28×.</w:t>
       </w:r>
     </w:p>
     <w:p>
@@ -2944,7 +3120,7 @@
           <w:b w:val="0"/>
           <w:i w:val="0"/>
         </w:rPr>
-        <w:t>hand-written rule it replaced got 9. Then I found the broken feature the model had been ignoring.</w:t>
+        <w:t>I report that instead of my first number, which looked better and turned out to be one lucky split.</w:t>
       </w:r>
     </w:p>
     <w:p/>
@@ -3050,14 +3226,14 @@
           <w:b/>
           <w:i w:val="0"/>
         </w:rPr>
-        <w:t>Added the split.</w:t>
+        <w:t>Named the validation design.</w:t>
       </w:r>
       <w:r>
         <w:rPr>
           <w:b w:val="0"/>
           <w:i w:val="0"/>
         </w:rPr>
-        <w:t xml:space="preserve"> 0.620 without "client-grouped test split" is a number I could have got by</w:t>
+        <w:t xml:space="preserve"> "Held out one client at a time" is the difference between a</w:t>
       </w:r>
     </w:p>
     <w:p>
@@ -3066,7 +3242,7 @@
           <w:b w:val="0"/>
           <w:i w:val="0"/>
         </w:rPr>
-        <w:t>cheating, and any reviewer worth working for will assume I did.</w:t>
+        <w:t>number a reviewer can check and one they have to take on faith. A bare decimal with no split named is a number any reviewer worth working for will assume was cherry-picked.</w:t>
       </w:r>
     </w:p>
     <w:p>
@@ -3078,14 +3254,14 @@
           <w:b/>
           <w:i w:val="0"/>
         </w:rPr>
-        <w:t>Added the failure.</w:t>
+        <w:t>Reported the worse number.</w:t>
       </w:r>
       <w:r>
         <w:rPr>
           <w:b w:val="0"/>
           <w:i w:val="0"/>
         </w:rPr>
-        <w:t xml:space="preserve"> The broken-feature sentence is the only line in the paragraph that a</w:t>
+        <w:t xml:space="preserve"> The last sentence is the only line a generic draft would never</w:t>
       </w:r>
     </w:p>
     <w:p>
@@ -3094,7 +3270,7 @@
           <w:b w:val="0"/>
           <w:i w:val="0"/>
         </w:rPr>
-        <w:t>generic draft would never produce, and it's the one that says something true about how I work.</w:t>
+        <w:t>produce — no AI first draft volunteers that its headline figure was one lucky split. It's also the only line that says something true about how I work.</w:t>
       </w:r>
     </w:p>
     <w:p>

</xml_diff>

<commit_message>
Confirming re-run: both notebooks now agree, row-order bug closed
w05 and w06 re-run with the ORDER BY fix. Both report 0.540 for the seed-42
split - they disagreed at 0.600 and 0.620 before it. That is the fix verified,
not just applied.

Final measured numbers, from the two committed notebooks:
  seed 42     base 0.161, rule 0.100, logistic 0.260, forest 0.540
  seed sweep  0.24-0.58, mean 0.486, sd 0.112, nine clients in every split
  LOCO        21 of 24 scoreable clients beat their own base rate, mean lift
              2.31x (median 1.79x), mean P@50 0.295, range 0.04-0.78
  date anchor 65,211 of 81,446 rows (80.1%) negative; dropping the feature
              raises the sweep mean from 0.486 to 0.546

Case 1, the content map, the figure and the .docx all realigned.
</commit_message>
<xml_diff>
--- a/work/Portfolio cases - Muneeb Ur Rehman.docx
+++ b/work/Portfolio cases - Muneeb Ur Rehman.docx
@@ -1174,14 +1174,14 @@
                 <w:b/>
                 <w:i w:val="0"/>
               </w:rPr>
-              <w:t>2.17×</w:t>
+              <w:t>2.31×</w:t>
             </w:r>
             <w:r>
               <w:rPr>
                 <w:b w:val="0"/>
                 <w:i w:val="0"/>
               </w:rPr>
-              <w:t xml:space="preserve"> (median 1.78×)</w:t>
+              <w:t xml:space="preserve"> (median 1.79×)</w:t>
             </w:r>
           </w:p>
         </w:tc>
@@ -1213,7 +1213,7 @@
                 <w:b w:val="0"/>
                 <w:i w:val="0"/>
               </w:rPr>
-              <w:t>0.291 (median 0.240)</w:t>
+              <w:t>0.295 (median 0.270)</w:t>
             </w:r>
           </w:p>
         </w:tc>
@@ -1245,7 +1245,7 @@
                 <w:b w:val="0"/>
                 <w:i w:val="0"/>
               </w:rPr>
-              <w:t>0.04 – 0.72</w:t>
+              <w:t>0.04 – 0.78</w:t>
             </w:r>
           </w:p>
         </w:tc>
@@ -1410,7 +1410,7 @@
                 <w:b w:val="0"/>
                 <w:i w:val="0"/>
               </w:rPr>
-              <w:t>0.160</w:t>
+              <w:t>0.100</w:t>
             </w:r>
           </w:p>
         </w:tc>
@@ -1474,7 +1474,7 @@
                 <w:b w:val="0"/>
                 <w:i w:val="0"/>
               </w:rPr>
-              <w:t>0.600</w:t>
+              <w:t>0.540</w:t>
             </w:r>
           </w:p>
         </w:tc>
@@ -1517,7 +1517,7 @@
           <w:b/>
           <w:i w:val="0"/>
         </w:rPr>
-        <w:t>0.34 to 0.66, mean 0.509, sd 0.111</w:t>
+        <w:t>0.24 to 0.58, mean 0.486, sd 0.112</w:t>
       </w:r>
       <w:r>
         <w:rPr>
@@ -1586,7 +1586,7 @@
           <w:b/>
           <w:i w:val="0"/>
         </w:rPr>
-        <w:t>0.509 to 0.566</w:t>
+        <w:t>0.486 to 0.546</w:t>
       </w:r>
       <w:r>
         <w:rPr>
@@ -1666,7 +1666,7 @@
           <w:b w:val="0"/>
           <w:i w:val="0"/>
         </w:rPr>
-        <w:t xml:space="preserve"> reports 0.600 for the seed-42 split and </w:t>
+        <w:t xml:space="preserve"> reported 0.600 for the seed-42 split while </w:t>
       </w:r>
       <w:r>
         <w:rPr>
@@ -1682,7 +1682,7 @@
           <w:b w:val="0"/>
           <w:i w:val="0"/>
         </w:rPr>
-        <w:t xml:space="preserve"> reports 0.620. Same seed, same 81,446 rows, same split design. The cause is that DuckDB gives no row-order guarantee without an </w:t>
+        <w:t xml:space="preserve"> reported 0.620. Same seed, same 81,446 rows, same split design. The cause is that DuckDB gives no row-order guarantee without an </w:t>
       </w:r>
       <w:r>
         <w:rPr>
@@ -1714,7 +1714,16 @@
           <w:b w:val="0"/>
           <w:i w:val="0"/>
         </w:rPr>
-        <w:t xml:space="preserve"> works on positional indices — so a fixed seed on an unordered frame is not actually reproducible. The queries now sort by </w:t>
+        <w:t xml:space="preserve"> works on positional indices — so a fixed seed over an unordered frame isn't reproducible at all. Every earlier number for that split, mine included, was one arbitrary draw wearing a fixed seed's clothing.</w:t>
+      </w:r>
+    </w:p>
+    <w:p>
+      <w:r>
+        <w:rPr>
+          <w:b w:val="0"/>
+          <w:i w:val="0"/>
+        </w:rPr>
+        <w:t xml:space="preserve">The queries now sort by </w:t>
       </w:r>
       <w:r>
         <w:rPr>
@@ -1730,7 +1739,21 @@
           <w:b w:val="0"/>
           <w:i w:val="0"/>
         </w:rPr>
-        <w:t>. One confirming re-run is outstanding; until it lands, treat 0.600 and 0.620 as the same number measured twice through a defect I've since fixed.</w:t>
+        <w:t xml:space="preserve">. </w:t>
+      </w:r>
+      <w:r>
+        <w:rPr>
+          <w:b/>
+          <w:i w:val="0"/>
+        </w:rPr>
+        <w:t>Both notebooks were re-run and both now report 0.540</w:t>
+      </w:r>
+      <w:r>
+        <w:rPr>
+          <w:b w:val="0"/>
+          <w:i w:val="0"/>
+        </w:rPr>
+        <w:t xml:space="preserve"> — the first value for this split that should reproduce on demand. That's the test worth holding me to: not "I fixed it", but "two notebooks that disagreed now agree, and here are both outputs."</w:t>
       </w:r>
     </w:p>
     <w:p>
@@ -1835,7 +1858,7 @@
           <w:b w:val="0"/>
           <w:i w:val="0"/>
         </w:rPr>
-        <w:t>It also doesn't say the model scores 0.600, or any single number. Across seven seeds of that same split design it ranged 0.34 to 0.66. The claim I'll defend is the LOCO one — 21 of 24 scoreable held-out clients beat their own base rate at a mean lift of 2.17× — because that's the only version where every client got tested rather than one draw of nine of them.</w:t>
+        <w:t>It also doesn't say the model scores 0.540, or any single number. Across seven seeds of that same split design it ranged 0.24 to 0.58. The claim I'll defend is the LOCO one — 21 of 24 scoreable held-out clients beat their own base rate at a mean lift of 2.31× — because that's the only version where every client got tested rather than one draw of nine of them.</w:t>
       </w:r>
     </w:p>
     <w:p>
@@ -3452,7 +3475,7 @@
           <w:b w:val="0"/>
           <w:i w:val="0"/>
         </w:rPr>
-        <w:t>2.17×. I report that instead of my first number, which looked better and turned out to be a draw of</w:t>
+        <w:t>2.31×. I report that instead of my first number, which looked better and turned out to be a draw of</w:t>
       </w:r>
     </w:p>
     <w:p>

</xml_diff>